<commit_message>
Respetar saltos de línea en TXT/DOCX
Co-Authored-By: Claude Opus 5.5 <noreply@anthropic.com>
Claude-Session: https://claude.ai/code/session_011tBz94YMaY7YngtLZRe8ni
</commit_message>
<xml_diff>
--- a/research/copies_ceramica_ES_CL.docx
+++ b/research/copies_ceramica_ES_CL.docx
@@ -76,7 +76,7 @@
         <w:t xml:space="preserve">✅ 100 plantillas con medidas y paso a paso</w:t>
       </w:r>
       <w:r>
-        <w:t xml:space="preserve"> </w:t>
+        <w:br/>
       </w:r>
       <w:r>
         <w:t xml:space="preserve">🎁 5 manuales de regalo para decorar, esmaltar y hornear</w:t>
@@ -303,7 +303,7 @@
         <w:t xml:space="preserve">✅ 100 plantillas con medidas y paso a paso</w:t>
       </w:r>
       <w:r>
-        <w:t xml:space="preserve"> </w:t>
+        <w:br/>
       </w:r>
       <w:r>
         <w:t xml:space="preserve">🎁 5 manuales de regalo para decorar, esmaltar y hornear</w:t>
@@ -703,7 +703,7 @@
         <w:t xml:space="preserve">✅ 100 plantillas con medidas y paso a paso</w:t>
       </w:r>
       <w:r>
-        <w:t xml:space="preserve"> </w:t>
+        <w:br/>
       </w:r>
       <w:r>
         <w:t xml:space="preserve">🎁 5 manuales de regalo para decorar, esmaltar y hornear</w:t>
@@ -810,7 +810,7 @@
         <w:t xml:space="preserve">✅ 100 plantillas con medidas y paso a paso</w:t>
       </w:r>
       <w:r>
-        <w:t xml:space="preserve"> </w:t>
+        <w:br/>
       </w:r>
       <w:r>
         <w:t xml:space="preserve">🎁 5 manuales de regalo para decorar, esmaltar y hornear</w:t>
@@ -902,7 +902,7 @@
         <w:t xml:space="preserve">✅ 100 plantillas con medidas y paso a paso</w:t>
       </w:r>
       <w:r>
-        <w:t xml:space="preserve"> </w:t>
+        <w:br/>
       </w:r>
       <w:r>
         <w:t xml:space="preserve">🎁 5 manuales de regalo para decorar, esmaltar y hornear</w:t>

</xml_diff>